<commit_message>
docs: add Magician StockMarket RPA and PDF to RDLC Report Migrator to portfolio and resume
</commit_message>
<xml_diff>
--- a/assets/Deepthi_T_Resume.docx
+++ b/assets/Deepthi_T_Resume.docx
@@ -874,6 +874,90 @@
           <w:color w:val="2D1C24"/>
           <w:sz w:val="20"/>
         </w:rPr>
+        <w:t>● Magician StockMarket RPA</w:t>
+      </w:r>
+      <w:r>
+        <w:rPr>
+          <w:rFonts w:ascii="Arial" w:hAnsi="Arial"/>
+          <w:b w:val="0"/>
+          <w:i/>
+          <w:color w:val="6366F1"/>
+          <w:sz w:val="18"/>
+        </w:rPr>
+        <w:t xml:space="preserve">  (Python, Playwright, Selenium, pandas, openpyxl)</w:t>
+      </w:r>
+    </w:p>
+    <w:p>
+      <w:pPr>
+        <w:spacing w:after="60"/>
+        <w:ind w:left="288"/>
+      </w:pPr>
+      <w:r>
+        <w:rPr>
+          <w:rFonts w:ascii="Arial" w:hAnsi="Arial"/>
+          <w:b w:val="0"/>
+          <w:i w:val="0"/>
+          <w:color w:val="2D1C24"/>
+          <w:sz w:val="19"/>
+        </w:rPr>
+        <w:t>RPA automation bot designed to scrape stock market analytical metrics and charts, compute pandas indicators, and format structured summaries in Excel.</w:t>
+      </w:r>
+    </w:p>
+    <w:p>
+      <w:pPr>
+        <w:keepNext/>
+        <w:spacing w:before="120" w:after="40"/>
+      </w:pPr>
+      <w:r>
+        <w:rPr>
+          <w:rFonts w:ascii="Arial" w:hAnsi="Arial"/>
+          <w:b/>
+          <w:i w:val="0"/>
+          <w:color w:val="2D1C24"/>
+          <w:sz w:val="20"/>
+        </w:rPr>
+        <w:t>● PDF to RDLC Report Migrator</w:t>
+      </w:r>
+      <w:r>
+        <w:rPr>
+          <w:rFonts w:ascii="Arial" w:hAnsi="Arial"/>
+          <w:b w:val="0"/>
+          <w:i/>
+          <w:color w:val="6366F1"/>
+          <w:sz w:val="18"/>
+        </w:rPr>
+        <w:t xml:space="preserve">  (C# .NET, XML Parser, RDLC Reports)</w:t>
+      </w:r>
+    </w:p>
+    <w:p>
+      <w:pPr>
+        <w:spacing w:after="60"/>
+        <w:ind w:left="288"/>
+      </w:pPr>
+      <w:r>
+        <w:rPr>
+          <w:rFonts w:ascii="Arial" w:hAnsi="Arial"/>
+          <w:b w:val="0"/>
+          <w:i w:val="0"/>
+          <w:color w:val="2D1C24"/>
+          <w:sz w:val="19"/>
+        </w:rPr>
+        <w:t>Reporting layout parser that reads static PDF coordinates and programmatically compiles them into native .NET client-side RDLC XML schema layouts.</w:t>
+      </w:r>
+    </w:p>
+    <w:p>
+      <w:pPr>
+        <w:keepNext/>
+        <w:spacing w:before="120" w:after="40"/>
+      </w:pPr>
+      <w:r>
+        <w:rPr>
+          <w:rFonts w:ascii="Arial" w:hAnsi="Arial"/>
+          <w:b/>
+          <w:i w:val="0"/>
+          <w:color w:val="2D1C24"/>
+          <w:sz w:val="20"/>
+        </w:rPr>
         <w:t>● ExploreCoders</w:t>
       </w:r>
       <w:r>

</xml_diff>

<commit_message>
chore: remove Magician Education Hub (Litelab) from portfolio and resume
</commit_message>
<xml_diff>
--- a/assets/Deepthi_T_Resume.docx
+++ b/assets/Deepthi_T_Resume.docx
@@ -748,48 +748,6 @@
           <w:color w:val="2D1C24"/>
           <w:sz w:val="20"/>
         </w:rPr>
-        <w:t>● Magician Education Hub (Litelab)</w:t>
-      </w:r>
-      <w:r>
-        <w:rPr>
-          <w:rFonts w:ascii="Arial" w:hAnsi="Arial"/>
-          <w:b w:val="0"/>
-          <w:i/>
-          <w:color w:val="6366F1"/>
-          <w:sz w:val="18"/>
-        </w:rPr>
-        <w:t xml:space="preserve">  (C# .NET 8 Web API, React JS, EF Core)</w:t>
-      </w:r>
-    </w:p>
-    <w:p>
-      <w:pPr>
-        <w:spacing w:after="60"/>
-        <w:ind w:left="288"/>
-      </w:pPr>
-      <w:r>
-        <w:rPr>
-          <w:rFonts w:ascii="Arial" w:hAnsi="Arial"/>
-          <w:b w:val="0"/>
-          <w:i w:val="0"/>
-          <w:color w:val="2D1C24"/>
-          <w:sz w:val="19"/>
-        </w:rPr>
-        <w:t>Multi-tenant learning portal featuring granular multi-role access controls (Principals, Teachers, Students), roster management tables, and dynamic color-coded diagnostics debugger panels.</w:t>
-      </w:r>
-    </w:p>
-    <w:p>
-      <w:pPr>
-        <w:keepNext/>
-        <w:spacing w:before="120" w:after="40"/>
-      </w:pPr>
-      <w:r>
-        <w:rPr>
-          <w:rFonts w:ascii="Arial" w:hAnsi="Arial"/>
-          <w:b/>
-          <w:i w:val="0"/>
-          <w:color w:val="2D1C24"/>
-          <w:sz w:val="20"/>
-        </w:rPr>
         <w:t>● RPAReviewAuditTDS</w:t>
       </w:r>
       <w:r>

</xml_diff>